<commit_message>
fix: colour keywords orange in every worksheet and concept sheet
Example code in unchanged worksheets and all concept sheets was inherited
from earlier builds with keywords in the old blue. A recolouring pass now
turns those keywords orange, splits plain runs such as "import random",
and returns keywords inside English notes (for example "1 and 6 can both
be rolled") to black. import, None, break and continue join the keyword
set; English "anything else" is no longer coloured.

Co-Authored-By: Claude Opus 5.5 <noreply@anthropic.com>
</commit_message>
<xml_diff>
--- a/Mapped Curriculum Lesson - Supplemental Material/Grade 6/Lesson 04 - Decisions/Decisions - Concept Sheet.docx
+++ b/Mapped Curriculum Lesson - Supplemental Material/Grade 6/Lesson 04 - Decisions/Decisions - Concept Sheet.docx
@@ -157,424 +157,424 @@
         <w:rPr>
           <w:sz w:val="28"/>
           <w:szCs w:val="28"/>
+          <w:color w:val="C45E00"/>
+        </w:rPr>
+        <w:t>if</w:t>
+      </w:r>
+      <w:r>
+        <w:rPr>
+          <w:sz w:val="28"/>
+          <w:szCs w:val="28"/>
+          <w:color w:val="080808"/>
+        </w:rPr>
+        <w:t xml:space="preserve"> choice </w:t>
+      </w:r>
+      <w:r>
+        <w:rPr>
+          <w:sz w:val="28"/>
+          <w:szCs w:val="28"/>
+          <w:color w:val="080808"/>
+          <w:rFonts w:ascii="Consolas" w:hAnsi="Consolas"/>
+        </w:rPr>
+        <w:t>==</w:t>
+      </w:r>
+      <w:r>
+        <w:rPr>
+          <w:sz w:val="28"/>
+          <w:szCs w:val="28"/>
+          <w:color w:val="080808"/>
+        </w:rPr>
+        <w:t xml:space="preserve"> </w:t>
+      </w:r>
+      <w:r>
+        <w:rPr>
+          <w:sz w:val="28"/>
+          <w:szCs w:val="28"/>
+          <w:color w:val="067D17"/>
+        </w:rPr>
+        <w:t>"walk"</w:t>
+      </w:r>
+      <w:r>
+        <w:rPr>
+          <w:sz w:val="28"/>
+          <w:szCs w:val="28"/>
+          <w:color w:val="080808"/>
+        </w:rPr>
+        <w:t>:</w:t>
+      </w:r>
+      <w:r>
+        <w:rPr>
+          <w:sz w:val="28"/>
+          <w:szCs w:val="28"/>
+          <w:color w:val="080808"/>
+        </w:rPr>
+        <w:br/>
+      </w:r>
+      <w:r>
+        <w:rPr>
+          <w:sz w:val="28"/>
+          <w:szCs w:val="28"/>
+          <w:color w:val="080808"/>
+        </w:rPr>
+        <w:t xml:space="preserve">    </w:t>
+      </w:r>
+      <w:r>
+        <w:rPr>
+          <w:sz w:val="28"/>
+          <w:szCs w:val="28"/>
           <w:color w:val="1750EB"/>
         </w:rPr>
-        <w:t>if</w:t>
-      </w:r>
-      <w:r>
-        <w:rPr>
-          <w:sz w:val="28"/>
-          <w:szCs w:val="28"/>
-          <w:color w:val="080808"/>
-        </w:rPr>
-        <w:t xml:space="preserve"> choice </w:t>
-      </w:r>
-      <w:r>
-        <w:rPr>
-          <w:sz w:val="28"/>
-          <w:szCs w:val="28"/>
-          <w:color w:val="080808"/>
+        <w:t>print</w:t>
+      </w:r>
+      <w:r>
+        <w:rPr>
+          <w:sz w:val="28"/>
+          <w:szCs w:val="28"/>
+          <w:color w:val="080808"/>
+        </w:rPr>
+        <w:t>(</w:t>
+      </w:r>
+      <w:r>
+        <w:rPr>
+          <w:sz w:val="28"/>
+          <w:szCs w:val="28"/>
+          <w:color w:val="067D17"/>
+        </w:rPr>
+        <w:t>"Take a walk."</w:t>
+      </w:r>
+      <w:r>
+        <w:rPr>
+          <w:sz w:val="28"/>
+          <w:szCs w:val="28"/>
+          <w:color w:val="080808"/>
+        </w:rPr>
+        <w:t>)</w:t>
+      </w:r>
+    </w:p>
+    <w:p>
+      <w:pPr>
+        <w:ind w:left="720" w:firstLine="720"/>
+        <w:rPr>
+          <w:rFonts w:ascii="JetBrains Mono" w:hAnsi="JetBrains Mono" w:cs="JetBrains Mono"/>
+          <w:sz w:val="28"/>
+          <w:szCs w:val="28"/>
+        </w:rPr>
+      </w:pPr>
+    </w:p>
+    <w:p>
+      <w:pPr>
+        <w:rPr>
+          <w:rStyle w:val="Heading2Char"/>
+        </w:rPr>
+      </w:pPr>
+      <w:r>
+        <w:rPr>
+          <w:rStyle w:val="Heading2Char"/>
+        </w:rPr>
+        <w:t>else</w:t>
+      </w:r>
+    </w:p>
+    <w:p>
+      <w:pPr>
+        <w:ind w:firstLine="720"/>
+      </w:pPr>
+      <w:r>
+        <w:t xml:space="preserve">Definition: </w:t>
+      </w:r>
+    </w:p>
+    <w:p>
+      <w:pPr>
+        <w:ind w:left="1440"/>
+      </w:pPr>
+      <w:r>
+        <w:rPr>
+          <w:color w:val="080808"/>
+        </w:rPr>
+        <w:t>else starts the other block. It runs when the if condition is False.</w:t>
+      </w:r>
+    </w:p>
+    <w:p>
+      <w:pPr>
+        <w:ind w:firstLine="720"/>
+      </w:pPr>
+      <w:r>
+        <w:t>Example:</w:t>
+      </w:r>
+    </w:p>
+    <w:p>
+      <w:pPr>
+        <w:ind w:left="720" w:firstLine="720"/>
+        <w:rPr>
+          <w:rFonts w:ascii="JetBrains Mono" w:hAnsi="JetBrains Mono" w:cs="JetBrains Mono"/>
+          <w:sz w:val="28"/>
+          <w:szCs w:val="28"/>
+        </w:rPr>
+      </w:pPr>
+      <w:r>
+        <w:rPr>
+          <w:sz w:val="28"/>
+          <w:szCs w:val="28"/>
+          <w:color w:val="C45E00"/>
+        </w:rPr>
+        <w:t>else</w:t>
+      </w:r>
+      <w:r>
+        <w:rPr>
+          <w:sz w:val="28"/>
+          <w:szCs w:val="28"/>
+          <w:color w:val="080808"/>
+        </w:rPr>
+        <w:t>:</w:t>
+      </w:r>
+      <w:r>
+        <w:rPr>
+          <w:sz w:val="28"/>
+          <w:szCs w:val="28"/>
+          <w:color w:val="080808"/>
+        </w:rPr>
+        <w:br/>
+      </w:r>
+      <w:r>
+        <w:rPr>
+          <w:sz w:val="28"/>
+          <w:szCs w:val="28"/>
+          <w:color w:val="080808"/>
+        </w:rPr>
+        <w:t xml:space="preserve">    </w:t>
+      </w:r>
+      <w:r>
+        <w:rPr>
+          <w:sz w:val="28"/>
+          <w:szCs w:val="28"/>
+          <w:color w:val="1750EB"/>
+        </w:rPr>
+        <w:t>print</w:t>
+      </w:r>
+      <w:r>
+        <w:rPr>
+          <w:sz w:val="28"/>
+          <w:szCs w:val="28"/>
+          <w:color w:val="080808"/>
+        </w:rPr>
+        <w:t>(</w:t>
+      </w:r>
+      <w:r>
+        <w:rPr>
+          <w:sz w:val="28"/>
+          <w:szCs w:val="28"/>
+          <w:color w:val="067D17"/>
+        </w:rPr>
+        <w:t>"Read a book."</w:t>
+      </w:r>
+      <w:r>
+        <w:rPr>
+          <w:sz w:val="28"/>
+          <w:szCs w:val="28"/>
+          <w:color w:val="080808"/>
+        </w:rPr>
+        <w:t>)</w:t>
+      </w:r>
+    </w:p>
+    <w:p>
+      <w:pPr>
+        <w:rPr>
+          <w:rFonts w:ascii="JetBrains Mono" w:hAnsi="JetBrains Mono" w:cs="JetBrains Mono"/>
+          <w:sz w:val="28"/>
+          <w:szCs w:val="28"/>
+        </w:rPr>
+      </w:pPr>
+      <w:r>
+        <w:rPr>
+          <w:rFonts w:ascii="JetBrains Mono" w:hAnsi="JetBrains Mono" w:cs="JetBrains Mono"/>
+          <w:sz w:val="28"/>
+          <w:szCs w:val="28"/>
+        </w:rPr>
+        <w:br w:type="page"/>
+      </w:r>
+    </w:p>
+    <w:p>
+      <w:pPr>
+        <w:rPr>
+          <w:rStyle w:val="Heading2Char"/>
+        </w:rPr>
+      </w:pPr>
+      <w:r>
+        <w:rPr>
+          <w:rStyle w:val="Heading2Char"/>
+        </w:rPr>
+        <w:t>==</w:t>
+      </w:r>
+    </w:p>
+    <w:p>
+      <w:pPr>
+        <w:ind w:firstLine="720"/>
+      </w:pPr>
+      <w:r>
+        <w:t xml:space="preserve">Definition: </w:t>
+      </w:r>
+    </w:p>
+    <w:p>
+      <w:pPr>
+        <w:ind w:left="720" w:firstLine="720"/>
+      </w:pPr>
+      <w:r>
+        <w:t>The == operator compares two values. It asks whether they are the same. It is different from =, which assigns a value.</w:t>
+      </w:r>
+    </w:p>
+    <w:p>
+      <w:pPr>
+        <w:ind w:firstLine="720"/>
+      </w:pPr>
+      <w:r>
+        <w:t>Example:</w:t>
+      </w:r>
+    </w:p>
+    <w:p>
+      <w:pPr>
+        <w:ind w:left="720" w:firstLine="720"/>
+      </w:pPr>
+      <w:r>
+        <w:rPr>
+          <w:color w:val="080808"/>
+          <w:sz w:val="28"/>
+          <w:szCs w:val="28"/>
+        </w:rPr>
+        <w:t xml:space="preserve">choice </w:t>
+      </w:r>
+      <w:r>
+        <w:rPr>
+          <w:color w:val="080808"/>
+          <w:sz w:val="28"/>
+          <w:szCs w:val="28"/>
           <w:rFonts w:ascii="Consolas" w:hAnsi="Consolas"/>
         </w:rPr>
         <w:t>==</w:t>
       </w:r>
       <w:r>
         <w:rPr>
-          <w:sz w:val="28"/>
-          <w:szCs w:val="28"/>
-          <w:color w:val="080808"/>
+          <w:color w:val="080808"/>
+          <w:sz w:val="28"/>
+          <w:szCs w:val="28"/>
         </w:rPr>
         <w:t xml:space="preserve"> </w:t>
       </w:r>
       <w:r>
         <w:rPr>
-          <w:sz w:val="28"/>
-          <w:szCs w:val="28"/>
           <w:color w:val="067D17"/>
+          <w:sz w:val="28"/>
+          <w:szCs w:val="28"/>
         </w:rPr>
         <w:t>"walk"</w:t>
       </w:r>
-      <w:r>
-        <w:rPr>
-          <w:sz w:val="28"/>
-          <w:szCs w:val="28"/>
-          <w:color w:val="080808"/>
-        </w:rPr>
-        <w:t>:</w:t>
-      </w:r>
-      <w:r>
-        <w:rPr>
-          <w:sz w:val="28"/>
-          <w:szCs w:val="28"/>
-          <w:color w:val="080808"/>
-        </w:rPr>
-        <w:br/>
-      </w:r>
-      <w:r>
-        <w:rPr>
-          <w:sz w:val="28"/>
-          <w:szCs w:val="28"/>
-          <w:color w:val="080808"/>
-        </w:rPr>
-        <w:t xml:space="preserve">    </w:t>
-      </w:r>
-      <w:r>
-        <w:rPr>
-          <w:sz w:val="28"/>
-          <w:szCs w:val="28"/>
+    </w:p>
+    <w:p>
+      <w:pPr>
+        <w:rPr>
+          <w:rFonts w:ascii="JetBrains Mono" w:hAnsi="JetBrains Mono" w:cs="JetBrains Mono"/>
+          <w:sz w:val="28"/>
+          <w:szCs w:val="28"/>
+        </w:rPr>
+      </w:pPr>
+    </w:p>
+    <w:p>
+      <w:pPr>
+        <w:rPr>
+          <w:rStyle w:val="Heading2Char"/>
+        </w:rPr>
+      </w:pPr>
+      <w:r>
+        <w:rPr>
+          <w:rStyle w:val="Heading2Char"/>
+        </w:rPr>
+        <w:t>Two-way decision flow</w:t>
+      </w:r>
+    </w:p>
+    <w:p>
+      <w:pPr>
+        <w:ind w:firstLine="720"/>
+      </w:pPr>
+      <w:r>
+        <w:t xml:space="preserve">Definition: </w:t>
+      </w:r>
+    </w:p>
+    <w:p>
+      <w:pPr>
+        <w:ind w:left="1440"/>
+      </w:pPr>
+      <w:r>
+        <w:rPr>
+          <w:color w:val="080808"/>
+        </w:rPr>
+        <w:t>A flow diagram uses start/stop, input/output, process and decision symbols. A decision has labelled True and False paths; an if/else program follows one of those two paths.</w:t>
+      </w:r>
+    </w:p>
+    <w:p>
+      <w:pPr>
+        <w:ind w:firstLine="720"/>
+      </w:pPr>
+      <w:r>
+        <w:t>Example:</w:t>
+      </w:r>
+    </w:p>
+    <w:p>
+      <w:pPr>
+        <w:ind w:left="720" w:firstLine="720"/>
+        <w:rPr>
+          <w:rFonts w:ascii="JetBrains Mono" w:hAnsi="JetBrains Mono" w:cs="JetBrains Mono"/>
+          <w:color w:val="080808"/>
+          <w:sz w:val="28"/>
+          <w:szCs w:val="28"/>
+        </w:rPr>
+      </w:pPr>
+      <w:r>
+        <w:rPr>
+          <w:color w:val="080808"/>
+          <w:sz w:val="28"/>
+          <w:szCs w:val="28"/>
+        </w:rPr>
+        <w:t xml:space="preserve">Start → </w:t>
+      </w:r>
+      <w:r>
+        <w:rPr>
           <w:color w:val="1750EB"/>
-        </w:rPr>
-        <w:t>print</w:t>
-      </w:r>
-      <w:r>
-        <w:rPr>
-          <w:sz w:val="28"/>
-          <w:szCs w:val="28"/>
-          <w:color w:val="080808"/>
-        </w:rPr>
-        <w:t>(</w:t>
-      </w:r>
-      <w:r>
-        <w:rPr>
-          <w:sz w:val="28"/>
-          <w:szCs w:val="28"/>
+          <w:sz w:val="28"/>
+          <w:szCs w:val="28"/>
+        </w:rPr>
+        <w:t>input</w:t>
+      </w:r>
+      <w:r>
+        <w:rPr>
+          <w:color w:val="080808"/>
+          <w:sz w:val="28"/>
+          <w:szCs w:val="28"/>
+        </w:rPr>
+        <w:t xml:space="preserve"> choice → choice </w:t>
+      </w:r>
+      <w:r>
+        <w:rPr>
+          <w:color w:val="080808"/>
+          <w:sz w:val="28"/>
+          <w:szCs w:val="28"/>
+          <w:rFonts w:ascii="Consolas" w:hAnsi="Consolas"/>
+        </w:rPr>
+        <w:t>==</w:t>
+      </w:r>
+      <w:r>
+        <w:rPr>
+          <w:color w:val="080808"/>
+          <w:sz w:val="28"/>
+          <w:szCs w:val="28"/>
+        </w:rPr>
+        <w:t xml:space="preserve"> </w:t>
+      </w:r>
+      <w:r>
+        <w:rPr>
           <w:color w:val="067D17"/>
-        </w:rPr>
-        <w:t>"Take a walk."</w:t>
-      </w:r>
-      <w:r>
-        <w:rPr>
-          <w:sz w:val="28"/>
-          <w:szCs w:val="28"/>
-          <w:color w:val="080808"/>
-        </w:rPr>
-        <w:t>)</w:t>
-      </w:r>
-    </w:p>
-    <w:p>
-      <w:pPr>
-        <w:ind w:left="720" w:firstLine="720"/>
-        <w:rPr>
-          <w:rFonts w:ascii="JetBrains Mono" w:hAnsi="JetBrains Mono" w:cs="JetBrains Mono"/>
-          <w:sz w:val="28"/>
-          <w:szCs w:val="28"/>
-        </w:rPr>
-      </w:pPr>
-    </w:p>
-    <w:p>
-      <w:pPr>
-        <w:rPr>
-          <w:rStyle w:val="Heading2Char"/>
-        </w:rPr>
-      </w:pPr>
-      <w:r>
-        <w:rPr>
-          <w:rStyle w:val="Heading2Char"/>
-        </w:rPr>
-        <w:t>else</w:t>
-      </w:r>
-    </w:p>
-    <w:p>
-      <w:pPr>
-        <w:ind w:firstLine="720"/>
-      </w:pPr>
-      <w:r>
-        <w:t xml:space="preserve">Definition: </w:t>
-      </w:r>
-    </w:p>
-    <w:p>
-      <w:pPr>
-        <w:ind w:left="1440"/>
-      </w:pPr>
-      <w:r>
-        <w:rPr>
-          <w:color w:val="080808"/>
-        </w:rPr>
-        <w:t>else starts the other block. It runs when the if condition is False.</w:t>
-      </w:r>
-    </w:p>
-    <w:p>
-      <w:pPr>
-        <w:ind w:firstLine="720"/>
-      </w:pPr>
-      <w:r>
-        <w:t>Example:</w:t>
-      </w:r>
-    </w:p>
-    <w:p>
-      <w:pPr>
-        <w:ind w:left="720" w:firstLine="720"/>
-        <w:rPr>
-          <w:rFonts w:ascii="JetBrains Mono" w:hAnsi="JetBrains Mono" w:cs="JetBrains Mono"/>
-          <w:sz w:val="28"/>
-          <w:szCs w:val="28"/>
-        </w:rPr>
-      </w:pPr>
-      <w:r>
-        <w:rPr>
-          <w:sz w:val="28"/>
-          <w:szCs w:val="28"/>
-          <w:color w:val="1750EB"/>
-        </w:rPr>
-        <w:t>else</w:t>
-      </w:r>
-      <w:r>
-        <w:rPr>
-          <w:sz w:val="28"/>
-          <w:szCs w:val="28"/>
-          <w:color w:val="080808"/>
-        </w:rPr>
-        <w:t>:</w:t>
-      </w:r>
-      <w:r>
-        <w:rPr>
-          <w:sz w:val="28"/>
-          <w:szCs w:val="28"/>
-          <w:color w:val="080808"/>
-        </w:rPr>
-        <w:br/>
-      </w:r>
-      <w:r>
-        <w:rPr>
-          <w:sz w:val="28"/>
-          <w:szCs w:val="28"/>
-          <w:color w:val="080808"/>
-        </w:rPr>
-        <w:t xml:space="preserve">    </w:t>
-      </w:r>
-      <w:r>
-        <w:rPr>
-          <w:sz w:val="28"/>
-          <w:szCs w:val="28"/>
-          <w:color w:val="1750EB"/>
-        </w:rPr>
-        <w:t>print</w:t>
-      </w:r>
-      <w:r>
-        <w:rPr>
-          <w:sz w:val="28"/>
-          <w:szCs w:val="28"/>
-          <w:color w:val="080808"/>
-        </w:rPr>
-        <w:t>(</w:t>
-      </w:r>
-      <w:r>
-        <w:rPr>
-          <w:sz w:val="28"/>
-          <w:szCs w:val="28"/>
-          <w:color w:val="067D17"/>
-        </w:rPr>
-        <w:t>"Read a book."</w:t>
-      </w:r>
-      <w:r>
-        <w:rPr>
-          <w:sz w:val="28"/>
-          <w:szCs w:val="28"/>
-          <w:color w:val="080808"/>
-        </w:rPr>
-        <w:t>)</w:t>
-      </w:r>
-    </w:p>
-    <w:p>
-      <w:pPr>
-        <w:rPr>
-          <w:rFonts w:ascii="JetBrains Mono" w:hAnsi="JetBrains Mono" w:cs="JetBrains Mono"/>
-          <w:sz w:val="28"/>
-          <w:szCs w:val="28"/>
-        </w:rPr>
-      </w:pPr>
-      <w:r>
-        <w:rPr>
-          <w:rFonts w:ascii="JetBrains Mono" w:hAnsi="JetBrains Mono" w:cs="JetBrains Mono"/>
-          <w:sz w:val="28"/>
-          <w:szCs w:val="28"/>
-        </w:rPr>
-        <w:br w:type="page"/>
-      </w:r>
-    </w:p>
-    <w:p>
-      <w:pPr>
-        <w:rPr>
-          <w:rStyle w:val="Heading2Char"/>
-        </w:rPr>
-      </w:pPr>
-      <w:r>
-        <w:rPr>
-          <w:rStyle w:val="Heading2Char"/>
-        </w:rPr>
-        <w:t>==</w:t>
-      </w:r>
-    </w:p>
-    <w:p>
-      <w:pPr>
-        <w:ind w:firstLine="720"/>
-      </w:pPr>
-      <w:r>
-        <w:t xml:space="preserve">Definition: </w:t>
-      </w:r>
-    </w:p>
-    <w:p>
-      <w:pPr>
-        <w:ind w:left="720" w:firstLine="720"/>
-      </w:pPr>
-      <w:r>
-        <w:t>The == operator compares two values. It asks whether they are the same. It is different from =, which assigns a value.</w:t>
-      </w:r>
-    </w:p>
-    <w:p>
-      <w:pPr>
-        <w:ind w:firstLine="720"/>
-      </w:pPr>
-      <w:r>
-        <w:t>Example:</w:t>
-      </w:r>
-    </w:p>
-    <w:p>
-      <w:pPr>
-        <w:ind w:left="720" w:firstLine="720"/>
-      </w:pPr>
-      <w:r>
-        <w:rPr>
-          <w:color w:val="080808"/>
-          <w:sz w:val="28"/>
-          <w:szCs w:val="28"/>
-        </w:rPr>
-        <w:t xml:space="preserve">choice </w:t>
-      </w:r>
-      <w:r>
-        <w:rPr>
-          <w:color w:val="080808"/>
-          <w:sz w:val="28"/>
-          <w:szCs w:val="28"/>
-          <w:rFonts w:ascii="Consolas" w:hAnsi="Consolas"/>
-        </w:rPr>
-        <w:t>==</w:t>
-      </w:r>
-      <w:r>
-        <w:rPr>
-          <w:color w:val="080808"/>
-          <w:sz w:val="28"/>
-          <w:szCs w:val="28"/>
-        </w:rPr>
-        <w:t xml:space="preserve"> </w:t>
-      </w:r>
-      <w:r>
-        <w:rPr>
-          <w:color w:val="067D17"/>
           <w:sz w:val="28"/>
           <w:szCs w:val="28"/>
         </w:rPr>
         <w:t>"walk"</w:t>
       </w:r>
-    </w:p>
-    <w:p>
-      <w:pPr>
-        <w:rPr>
-          <w:rFonts w:ascii="JetBrains Mono" w:hAnsi="JetBrains Mono" w:cs="JetBrains Mono"/>
-          <w:sz w:val="28"/>
-          <w:szCs w:val="28"/>
-        </w:rPr>
-      </w:pPr>
-    </w:p>
-    <w:p>
-      <w:pPr>
-        <w:rPr>
-          <w:rStyle w:val="Heading2Char"/>
-        </w:rPr>
-      </w:pPr>
-      <w:r>
-        <w:rPr>
-          <w:rStyle w:val="Heading2Char"/>
-        </w:rPr>
-        <w:t>Two-way decision flow</w:t>
-      </w:r>
-    </w:p>
-    <w:p>
-      <w:pPr>
-        <w:ind w:firstLine="720"/>
-      </w:pPr>
-      <w:r>
-        <w:t xml:space="preserve">Definition: </w:t>
-      </w:r>
-    </w:p>
-    <w:p>
-      <w:pPr>
-        <w:ind w:left="1440"/>
-      </w:pPr>
-      <w:r>
-        <w:rPr>
-          <w:color w:val="080808"/>
-        </w:rPr>
-        <w:t>A flow diagram uses start/stop, input/output, process and decision symbols. A decision has labelled True and False paths; an if/else program follows one of those two paths.</w:t>
-      </w:r>
-    </w:p>
-    <w:p>
-      <w:pPr>
-        <w:ind w:firstLine="720"/>
-      </w:pPr>
-      <w:r>
-        <w:t>Example:</w:t>
-      </w:r>
-    </w:p>
-    <w:p>
-      <w:pPr>
-        <w:ind w:left="720" w:firstLine="720"/>
-        <w:rPr>
-          <w:rFonts w:ascii="JetBrains Mono" w:hAnsi="JetBrains Mono" w:cs="JetBrains Mono"/>
-          <w:color w:val="080808"/>
-          <w:sz w:val="28"/>
-          <w:szCs w:val="28"/>
-        </w:rPr>
-      </w:pPr>
-      <w:r>
-        <w:rPr>
-          <w:color w:val="080808"/>
-          <w:sz w:val="28"/>
-          <w:szCs w:val="28"/>
-        </w:rPr>
-        <w:t xml:space="preserve">Start → </w:t>
-      </w:r>
-      <w:r>
-        <w:rPr>
-          <w:color w:val="1750EB"/>
-          <w:sz w:val="28"/>
-          <w:szCs w:val="28"/>
-        </w:rPr>
-        <w:t>input</w:t>
-      </w:r>
-      <w:r>
-        <w:rPr>
-          <w:color w:val="080808"/>
-          <w:sz w:val="28"/>
-          <w:szCs w:val="28"/>
-        </w:rPr>
-        <w:t xml:space="preserve"> choice → choice </w:t>
-      </w:r>
-      <w:r>
-        <w:rPr>
-          <w:color w:val="080808"/>
-          <w:sz w:val="28"/>
-          <w:szCs w:val="28"/>
-          <w:rFonts w:ascii="Consolas" w:hAnsi="Consolas"/>
-        </w:rPr>
-        <w:t>==</w:t>
-      </w:r>
-      <w:r>
-        <w:rPr>
-          <w:color w:val="080808"/>
-          <w:sz w:val="28"/>
-          <w:szCs w:val="28"/>
-        </w:rPr>
-        <w:t xml:space="preserve"> </w:t>
-      </w:r>
-      <w:r>
-        <w:rPr>
-          <w:color w:val="067D17"/>
-          <w:sz w:val="28"/>
-          <w:szCs w:val="28"/>
-        </w:rPr>
-        <w:t>"walk"</w:t>
-      </w:r>
       <w:r>
         <w:rPr>
           <w:color w:val="080808"/>
@@ -585,7 +585,7 @@
       </w:r>
       <w:r>
         <w:rPr>
-          <w:color w:val="1750EB"/>
+          <w:color w:val="C45E00"/>
           <w:sz w:val="28"/>
           <w:szCs w:val="28"/>
         </w:rPr>
@@ -601,7 +601,7 @@
       </w:r>
       <w:r>
         <w:rPr>
-          <w:color w:val="1750EB"/>
+          <w:color w:val="C45E00"/>
           <w:sz w:val="28"/>
           <w:szCs w:val="28"/>
         </w:rPr>

</xml_diff>